<commit_message>
feat(metais-values-and-rules): [W3-1] refuse a criterion answered twice or a required criterion missing in the ACR
Signed-off-by: Edward Funnekotter <3941907+efunneko@users.noreply.github.com>
</commit_message>
<xml_diff>
--- a/examples/accessibility-conformance-report/examples/wcag_only/expected/acr.docx
+++ b/examples/accessibility-conformance-report/examples/wcag_only/expected/acr.docx
@@ -50,7 +50,7 @@
         <w:t xml:space="preserve">WCAG 2.2: </w:t>
       </w:r>
       <w:r>
-        <w:t xml:space="preserve">4 Supports, 1 Partially Supports, 1 Does Not Support, 1 Not Evaluated (7 criteria)</w:t>
+        <w:t xml:space="preserve">41 Supports, 1 Partially Supports, 1 Does Not Support, 12 Not Applicable, 1 Not Evaluated (56 criteria)</w:t>
       </w:r>
     </w:p>
     <w:p>
@@ -305,6 +305,426 @@
           </w:tcPr>
           <w:p>
             <w:r>
+              <w:t xml:space="preserve">1.2.1 Audio-only and Video-only (Prerecorded) (Level A)</w:t>
+            </w:r>
+          </w:p>
+        </w:tc>
+        <w:tc>
+          <w:tcPr>
+            <w:tcW w:w="1800" w:type="dxa"/>
+          </w:tcPr>
+          <w:p>
+            <w:r>
+              <w:t>Not Applicable</w:t>
+            </w:r>
+          </w:p>
+        </w:tc>
+        <w:tc>
+          <w:tcPr>
+            <w:tcW w:w="4560" w:type="dxa"/>
+          </w:tcPr>
+          <w:p>
+            <w:r>
+              <w:t xml:space="preserve">The product has no audio-only or video-only content.</w:t>
+            </w:r>
+          </w:p>
+        </w:tc>
+      </w:tr>
+      <w:tr>
+        <w:trPr>
+          <w:cantSplit/>
+        </w:trPr>
+        <w:tc>
+          <w:tcPr>
+            <w:tcW w:w="3000" w:type="dxa"/>
+          </w:tcPr>
+          <w:p>
+            <w:r>
+              <w:t xml:space="preserve">1.2.2 Captions (Prerecorded) (Level A)</w:t>
+            </w:r>
+          </w:p>
+        </w:tc>
+        <w:tc>
+          <w:tcPr>
+            <w:tcW w:w="1800" w:type="dxa"/>
+          </w:tcPr>
+          <w:p>
+            <w:r>
+              <w:t>Not Applicable</w:t>
+            </w:r>
+          </w:p>
+        </w:tc>
+        <w:tc>
+          <w:tcPr>
+            <w:tcW w:w="4560" w:type="dxa"/>
+          </w:tcPr>
+          <w:p>
+            <w:r>
+              <w:t xml:space="preserve">The product has no prerecorded video.</w:t>
+            </w:r>
+          </w:p>
+        </w:tc>
+      </w:tr>
+      <w:tr>
+        <w:trPr>
+          <w:cantSplit/>
+        </w:trPr>
+        <w:tc>
+          <w:tcPr>
+            <w:tcW w:w="3000" w:type="dxa"/>
+          </w:tcPr>
+          <w:p>
+            <w:r>
+              <w:t xml:space="preserve">1.2.3 Audio Description or Media Alternative (Prerecorded) (Level A)</w:t>
+            </w:r>
+          </w:p>
+        </w:tc>
+        <w:tc>
+          <w:tcPr>
+            <w:tcW w:w="1800" w:type="dxa"/>
+          </w:tcPr>
+          <w:p>
+            <w:r>
+              <w:t>Not Applicable</w:t>
+            </w:r>
+          </w:p>
+        </w:tc>
+        <w:tc>
+          <w:tcPr>
+            <w:tcW w:w="4560" w:type="dxa"/>
+          </w:tcPr>
+          <w:p>
+            <w:r>
+              <w:t xml:space="preserve">The product has no prerecorded video.</w:t>
+            </w:r>
+          </w:p>
+        </w:tc>
+      </w:tr>
+      <w:tr>
+        <w:trPr>
+          <w:cantSplit/>
+        </w:trPr>
+        <w:tc>
+          <w:tcPr>
+            <w:tcW w:w="3000" w:type="dxa"/>
+          </w:tcPr>
+          <w:p>
+            <w:r>
+              <w:t xml:space="preserve">1.2.4 Captions (Live) (Level AA)</w:t>
+            </w:r>
+          </w:p>
+        </w:tc>
+        <w:tc>
+          <w:tcPr>
+            <w:tcW w:w="1800" w:type="dxa"/>
+          </w:tcPr>
+          <w:p>
+            <w:r>
+              <w:t>Not Applicable</w:t>
+            </w:r>
+          </w:p>
+        </w:tc>
+        <w:tc>
+          <w:tcPr>
+            <w:tcW w:w="4560" w:type="dxa"/>
+          </w:tcPr>
+          <w:p>
+            <w:r>
+              <w:t xml:space="preserve">The product has no live video.</w:t>
+            </w:r>
+          </w:p>
+        </w:tc>
+      </w:tr>
+      <w:tr>
+        <w:trPr>
+          <w:cantSplit/>
+        </w:trPr>
+        <w:tc>
+          <w:tcPr>
+            <w:tcW w:w="3000" w:type="dxa"/>
+          </w:tcPr>
+          <w:p>
+            <w:r>
+              <w:t xml:space="preserve">1.2.5 Audio Description (Prerecorded) (Level AA)</w:t>
+            </w:r>
+          </w:p>
+        </w:tc>
+        <w:tc>
+          <w:tcPr>
+            <w:tcW w:w="1800" w:type="dxa"/>
+          </w:tcPr>
+          <w:p>
+            <w:r>
+              <w:t>Not Applicable</w:t>
+            </w:r>
+          </w:p>
+        </w:tc>
+        <w:tc>
+          <w:tcPr>
+            <w:tcW w:w="4560" w:type="dxa"/>
+          </w:tcPr>
+          <w:p>
+            <w:r>
+              <w:t xml:space="preserve">The product has no prerecorded video.</w:t>
+            </w:r>
+          </w:p>
+        </w:tc>
+      </w:tr>
+      <w:tr>
+        <w:trPr>
+          <w:cantSplit/>
+        </w:trPr>
+        <w:tc>
+          <w:tcPr>
+            <w:tcW w:w="3000" w:type="dxa"/>
+          </w:tcPr>
+          <w:p>
+            <w:r>
+              <w:t xml:space="preserve">1.3.1 Info and Relationships (Level A)</w:t>
+            </w:r>
+          </w:p>
+        </w:tc>
+        <w:tc>
+          <w:tcPr>
+            <w:tcW w:w="1800" w:type="dxa"/>
+          </w:tcPr>
+          <w:p>
+            <w:r>
+              <w:t>Supports</w:t>
+            </w:r>
+          </w:p>
+        </w:tc>
+        <w:tc>
+          <w:tcPr>
+            <w:tcW w:w="4560" w:type="dxa"/>
+          </w:tcPr>
+          <w:p>
+            <w:r>
+              <w:t xml:space="preserve">Headings, lists, tables and form fields are marked up as such.</w:t>
+            </w:r>
+          </w:p>
+        </w:tc>
+      </w:tr>
+      <w:tr>
+        <w:trPr>
+          <w:cantSplit/>
+        </w:trPr>
+        <w:tc>
+          <w:tcPr>
+            <w:tcW w:w="3000" w:type="dxa"/>
+          </w:tcPr>
+          <w:p>
+            <w:r>
+              <w:t xml:space="preserve">1.3.2 Meaningful Sequence (Level A)</w:t>
+            </w:r>
+          </w:p>
+        </w:tc>
+        <w:tc>
+          <w:tcPr>
+            <w:tcW w:w="1800" w:type="dxa"/>
+          </w:tcPr>
+          <w:p>
+            <w:r>
+              <w:t>Supports</w:t>
+            </w:r>
+          </w:p>
+        </w:tc>
+        <w:tc>
+          <w:tcPr>
+            <w:tcW w:w="4560" w:type="dxa"/>
+          </w:tcPr>
+          <w:p>
+            <w:r>
+              <w:t xml:space="preserve">The reading order of every page follows its visual order.</w:t>
+            </w:r>
+          </w:p>
+        </w:tc>
+      </w:tr>
+      <w:tr>
+        <w:trPr>
+          <w:cantSplit/>
+        </w:trPr>
+        <w:tc>
+          <w:tcPr>
+            <w:tcW w:w="3000" w:type="dxa"/>
+          </w:tcPr>
+          <w:p>
+            <w:r>
+              <w:t xml:space="preserve">1.3.3 Sensory Characteristics (Level A)</w:t>
+            </w:r>
+          </w:p>
+        </w:tc>
+        <w:tc>
+          <w:tcPr>
+            <w:tcW w:w="1800" w:type="dxa"/>
+          </w:tcPr>
+          <w:p>
+            <w:r>
+              <w:t>Supports</w:t>
+            </w:r>
+          </w:p>
+        </w:tc>
+        <w:tc>
+          <w:tcPr>
+            <w:tcW w:w="4560" w:type="dxa"/>
+          </w:tcPr>
+          <w:p>
+            <w:r>
+              <w:t xml:space="preserve">No instruction relies on shape or position alone.</w:t>
+            </w:r>
+          </w:p>
+        </w:tc>
+      </w:tr>
+      <w:tr>
+        <w:trPr>
+          <w:cantSplit/>
+        </w:trPr>
+        <w:tc>
+          <w:tcPr>
+            <w:tcW w:w="3000" w:type="dxa"/>
+          </w:tcPr>
+          <w:p>
+            <w:r>
+              <w:t xml:space="preserve">1.3.4 Orientation (Level AA)</w:t>
+            </w:r>
+          </w:p>
+        </w:tc>
+        <w:tc>
+          <w:tcPr>
+            <w:tcW w:w="1800" w:type="dxa"/>
+          </w:tcPr>
+          <w:p>
+            <w:r>
+              <w:t>Supports</w:t>
+            </w:r>
+          </w:p>
+        </w:tc>
+        <w:tc>
+          <w:tcPr>
+            <w:tcW w:w="4560" w:type="dxa"/>
+          </w:tcPr>
+          <w:p>
+            <w:r>
+              <w:t xml:space="preserve">Every page works in portrait and landscape.</w:t>
+            </w:r>
+          </w:p>
+        </w:tc>
+      </w:tr>
+      <w:tr>
+        <w:trPr>
+          <w:cantSplit/>
+        </w:trPr>
+        <w:tc>
+          <w:tcPr>
+            <w:tcW w:w="3000" w:type="dxa"/>
+          </w:tcPr>
+          <w:p>
+            <w:r>
+              <w:t xml:space="preserve">1.3.5 Identify Input Purpose (Level AA)</w:t>
+            </w:r>
+          </w:p>
+        </w:tc>
+        <w:tc>
+          <w:tcPr>
+            <w:tcW w:w="1800" w:type="dxa"/>
+          </w:tcPr>
+          <w:p>
+            <w:r>
+              <w:t>Supports</w:t>
+            </w:r>
+          </w:p>
+        </w:tc>
+        <w:tc>
+          <w:tcPr>
+            <w:tcW w:w="4560" w:type="dxa"/>
+          </w:tcPr>
+          <w:p>
+            <w:r>
+              <w:t xml:space="preserve">Fields for the user's name, email and address name their purpose.</w:t>
+            </w:r>
+          </w:p>
+        </w:tc>
+      </w:tr>
+      <w:tr>
+        <w:trPr>
+          <w:cantSplit/>
+        </w:trPr>
+        <w:tc>
+          <w:tcPr>
+            <w:tcW w:w="3000" w:type="dxa"/>
+          </w:tcPr>
+          <w:p>
+            <w:r>
+              <w:t xml:space="preserve">1.4.1 Use of Color (Level A)</w:t>
+            </w:r>
+          </w:p>
+        </w:tc>
+        <w:tc>
+          <w:tcPr>
+            <w:tcW w:w="1800" w:type="dxa"/>
+          </w:tcPr>
+          <w:p>
+            <w:r>
+              <w:t>Supports</w:t>
+            </w:r>
+          </w:p>
+        </w:tc>
+        <w:tc>
+          <w:tcPr>
+            <w:tcW w:w="4560" w:type="dxa"/>
+          </w:tcPr>
+          <w:p>
+            <w:r>
+              <w:t xml:space="preserve">Overdue invoices are marked by a word as well as a colour.</w:t>
+            </w:r>
+          </w:p>
+        </w:tc>
+      </w:tr>
+      <w:tr>
+        <w:trPr>
+          <w:cantSplit/>
+        </w:trPr>
+        <w:tc>
+          <w:tcPr>
+            <w:tcW w:w="3000" w:type="dxa"/>
+          </w:tcPr>
+          <w:p>
+            <w:r>
+              <w:t xml:space="preserve">1.4.2 Audio Control (Level A)</w:t>
+            </w:r>
+          </w:p>
+        </w:tc>
+        <w:tc>
+          <w:tcPr>
+            <w:tcW w:w="1800" w:type="dxa"/>
+          </w:tcPr>
+          <w:p>
+            <w:r>
+              <w:t>Not Applicable</w:t>
+            </w:r>
+          </w:p>
+        </w:tc>
+        <w:tc>
+          <w:tcPr>
+            <w:tcW w:w="4560" w:type="dxa"/>
+          </w:tcPr>
+          <w:p>
+            <w:r>
+              <w:t xml:space="preserve">The product plays no audio.</w:t>
+            </w:r>
+          </w:p>
+        </w:tc>
+      </w:tr>
+      <w:tr>
+        <w:trPr>
+          <w:cantSplit/>
+        </w:trPr>
+        <w:tc>
+          <w:tcPr>
+            <w:tcW w:w="3000" w:type="dxa"/>
+          </w:tcPr>
+          <w:p>
+            <w:r>
               <w:t xml:space="preserve">1.4.3 Contrast (Minimum) (Level AA)</w:t>
             </w:r>
           </w:p>
@@ -340,6 +760,212 @@
           </w:tcPr>
           <w:p>
             <w:r>
+              <w:t xml:space="preserve">1.4.4 Resize Text (Level AA)</w:t>
+            </w:r>
+          </w:p>
+        </w:tc>
+        <w:tc>
+          <w:tcPr>
+            <w:tcW w:w="1800" w:type="dxa"/>
+          </w:tcPr>
+          <w:p>
+            <w:r>
+              <w:t>Supports</w:t>
+            </w:r>
+          </w:p>
+        </w:tc>
+        <w:tc>
+          <w:tcPr>
+            <w:tcW w:w="4560" w:type="dxa"/>
+          </w:tcPr>
+          <w:p>
+            <w:r>
+              <w:t xml:space="preserve">Text can be enlarged to 200 percent with browser zoom without loss of content.</w:t>
+            </w:r>
+          </w:p>
+        </w:tc>
+      </w:tr>
+      <w:tr>
+        <w:trPr>
+          <w:cantSplit/>
+        </w:trPr>
+        <w:tc>
+          <w:tcPr>
+            <w:tcW w:w="3000" w:type="dxa"/>
+          </w:tcPr>
+          <w:p>
+            <w:r>
+              <w:t xml:space="preserve">1.4.5 Images of Text (Level AA)</w:t>
+            </w:r>
+          </w:p>
+        </w:tc>
+        <w:tc>
+          <w:tcPr>
+            <w:tcW w:w="1800" w:type="dxa"/>
+          </w:tcPr>
+          <w:p>
+            <w:r>
+              <w:t>Supports</w:t>
+            </w:r>
+          </w:p>
+        </w:tc>
+        <w:tc>
+          <w:tcPr>
+            <w:tcW w:w="4560" w:type="dxa"/>
+          </w:tcPr>
+          <w:p>
+            <w:r>
+              <w:t xml:space="preserve">The product shows no images of text.</w:t>
+            </w:r>
+          </w:p>
+        </w:tc>
+      </w:tr>
+      <w:tr>
+        <w:trPr>
+          <w:cantSplit/>
+        </w:trPr>
+        <w:tc>
+          <w:tcPr>
+            <w:tcW w:w="3000" w:type="dxa"/>
+          </w:tcPr>
+          <w:p>
+            <w:r>
+              <w:t xml:space="preserve">1.4.10 Reflow (Level AA)</w:t>
+            </w:r>
+          </w:p>
+        </w:tc>
+        <w:tc>
+          <w:tcPr>
+            <w:tcW w:w="1800" w:type="dxa"/>
+          </w:tcPr>
+          <w:p>
+            <w:r>
+              <w:t>Supports</w:t>
+            </w:r>
+          </w:p>
+        </w:tc>
+        <w:tc>
+          <w:tcPr>
+            <w:tcW w:w="4560" w:type="dxa"/>
+          </w:tcPr>
+          <w:p>
+            <w:r>
+              <w:t xml:space="preserve">Every page reflows to a width of 320 CSS pixels.</w:t>
+            </w:r>
+          </w:p>
+        </w:tc>
+      </w:tr>
+      <w:tr>
+        <w:trPr>
+          <w:cantSplit/>
+        </w:trPr>
+        <w:tc>
+          <w:tcPr>
+            <w:tcW w:w="3000" w:type="dxa"/>
+          </w:tcPr>
+          <w:p>
+            <w:r>
+              <w:t xml:space="preserve">1.4.11 Non-text Contrast (Level AA)</w:t>
+            </w:r>
+          </w:p>
+        </w:tc>
+        <w:tc>
+          <w:tcPr>
+            <w:tcW w:w="1800" w:type="dxa"/>
+          </w:tcPr>
+          <w:p>
+            <w:r>
+              <w:t>Supports</w:t>
+            </w:r>
+          </w:p>
+        </w:tc>
+        <w:tc>
+          <w:tcPr>
+            <w:tcW w:w="4560" w:type="dxa"/>
+          </w:tcPr>
+          <w:p>
+            <w:r>
+              <w:t xml:space="preserve">Controls and focus indicators meet the 3 to 1 ratio.</w:t>
+            </w:r>
+          </w:p>
+        </w:tc>
+      </w:tr>
+      <w:tr>
+        <w:trPr>
+          <w:cantSplit/>
+        </w:trPr>
+        <w:tc>
+          <w:tcPr>
+            <w:tcW w:w="3000" w:type="dxa"/>
+          </w:tcPr>
+          <w:p>
+            <w:r>
+              <w:t xml:space="preserve">1.4.12 Text Spacing (Level AA)</w:t>
+            </w:r>
+          </w:p>
+        </w:tc>
+        <w:tc>
+          <w:tcPr>
+            <w:tcW w:w="1800" w:type="dxa"/>
+          </w:tcPr>
+          <w:p>
+            <w:r>
+              <w:t>Supports</w:t>
+            </w:r>
+          </w:p>
+        </w:tc>
+        <w:tc>
+          <w:tcPr>
+            <w:tcW w:w="4560" w:type="dxa"/>
+          </w:tcPr>
+          <w:p/>
+        </w:tc>
+      </w:tr>
+      <w:tr>
+        <w:trPr>
+          <w:cantSplit/>
+        </w:trPr>
+        <w:tc>
+          <w:tcPr>
+            <w:tcW w:w="3000" w:type="dxa"/>
+          </w:tcPr>
+          <w:p>
+            <w:r>
+              <w:t xml:space="preserve">1.4.13 Content on Hover or Focus (Level AA)</w:t>
+            </w:r>
+          </w:p>
+        </w:tc>
+        <w:tc>
+          <w:tcPr>
+            <w:tcW w:w="1800" w:type="dxa"/>
+          </w:tcPr>
+          <w:p>
+            <w:r>
+              <w:t>Supports</w:t>
+            </w:r>
+          </w:p>
+        </w:tc>
+        <w:tc>
+          <w:tcPr>
+            <w:tcW w:w="4560" w:type="dxa"/>
+          </w:tcPr>
+          <w:p>
+            <w:r>
+              <w:t xml:space="preserve">Tooltips stay while hovered, and Escape dismisses them.</w:t>
+            </w:r>
+          </w:p>
+        </w:tc>
+      </w:tr>
+      <w:tr>
+        <w:trPr>
+          <w:cantSplit/>
+        </w:trPr>
+        <w:tc>
+          <w:tcPr>
+            <w:tcW w:w="3000" w:type="dxa"/>
+          </w:tcPr>
+          <w:p>
+            <w:r>
               <w:t xml:space="preserve">2.1.1 Keyboard (Level A)</w:t>
             </w:r>
           </w:p>
@@ -375,6 +1001,379 @@
           </w:tcPr>
           <w:p>
             <w:r>
+              <w:t xml:space="preserve">2.1.2 No Keyboard Trap (Level A)</w:t>
+            </w:r>
+          </w:p>
+        </w:tc>
+        <w:tc>
+          <w:tcPr>
+            <w:tcW w:w="1800" w:type="dxa"/>
+          </w:tcPr>
+          <w:p>
+            <w:r>
+              <w:t>Supports</w:t>
+            </w:r>
+          </w:p>
+        </w:tc>
+        <w:tc>
+          <w:tcPr>
+            <w:tcW w:w="4560" w:type="dxa"/>
+          </w:tcPr>
+          <w:p>
+            <w:r>
+              <w:t xml:space="preserve">Focus never becomes trapped, in dialogs included.</w:t>
+            </w:r>
+          </w:p>
+        </w:tc>
+      </w:tr>
+      <w:tr>
+        <w:trPr>
+          <w:cantSplit/>
+        </w:trPr>
+        <w:tc>
+          <w:tcPr>
+            <w:tcW w:w="3000" w:type="dxa"/>
+          </w:tcPr>
+          <w:p>
+            <w:r>
+              <w:t xml:space="preserve">2.1.4 Character Key Shortcuts (Level A)</w:t>
+            </w:r>
+          </w:p>
+        </w:tc>
+        <w:tc>
+          <w:tcPr>
+            <w:tcW w:w="1800" w:type="dxa"/>
+          </w:tcPr>
+          <w:p>
+            <w:r>
+              <w:t>Not Applicable</w:t>
+            </w:r>
+          </w:p>
+        </w:tc>
+        <w:tc>
+          <w:tcPr>
+            <w:tcW w:w="4560" w:type="dxa"/>
+          </w:tcPr>
+          <w:p>
+            <w:r>
+              <w:t xml:space="preserve">The product has no single-character keyboard shortcuts.</w:t>
+            </w:r>
+          </w:p>
+        </w:tc>
+      </w:tr>
+      <w:tr>
+        <w:trPr>
+          <w:cantSplit/>
+        </w:trPr>
+        <w:tc>
+          <w:tcPr>
+            <w:tcW w:w="3000" w:type="dxa"/>
+          </w:tcPr>
+          <w:p>
+            <w:r>
+              <w:t xml:space="preserve">2.2.1 Timing Adjustable (Level A)</w:t>
+            </w:r>
+          </w:p>
+        </w:tc>
+        <w:tc>
+          <w:tcPr>
+            <w:tcW w:w="1800" w:type="dxa"/>
+          </w:tcPr>
+          <w:p>
+            <w:r>
+              <w:t>Supports</w:t>
+            </w:r>
+          </w:p>
+        </w:tc>
+        <w:tc>
+          <w:tcPr>
+            <w:tcW w:w="4560" w:type="dxa"/>
+          </w:tcPr>
+          <w:p>
+            <w:r>
+              <w:t xml:space="preserve">The session warns before it times out and can be extended.</w:t>
+            </w:r>
+          </w:p>
+        </w:tc>
+      </w:tr>
+      <w:tr>
+        <w:trPr>
+          <w:cantSplit/>
+        </w:trPr>
+        <w:tc>
+          <w:tcPr>
+            <w:tcW w:w="3000" w:type="dxa"/>
+          </w:tcPr>
+          <w:p>
+            <w:r>
+              <w:t xml:space="preserve">2.2.2 Pause, Stop, Hide (Level A)</w:t>
+            </w:r>
+          </w:p>
+        </w:tc>
+        <w:tc>
+          <w:tcPr>
+            <w:tcW w:w="1800" w:type="dxa"/>
+          </w:tcPr>
+          <w:p>
+            <w:r>
+              <w:t>Not Applicable</w:t>
+            </w:r>
+          </w:p>
+        </w:tc>
+        <w:tc>
+          <w:tcPr>
+            <w:tcW w:w="4560" w:type="dxa"/>
+          </w:tcPr>
+          <w:p>
+            <w:r>
+              <w:t xml:space="preserve">Nothing on the product's pages moves or updates on its own.</w:t>
+            </w:r>
+          </w:p>
+        </w:tc>
+      </w:tr>
+      <w:tr>
+        <w:trPr>
+          <w:cantSplit/>
+        </w:trPr>
+        <w:tc>
+          <w:tcPr>
+            <w:tcW w:w="3000" w:type="dxa"/>
+          </w:tcPr>
+          <w:p>
+            <w:r>
+              <w:t xml:space="preserve">2.3.1 Three Flashes or Below Threshold (Level A)</w:t>
+            </w:r>
+          </w:p>
+        </w:tc>
+        <w:tc>
+          <w:tcPr>
+            <w:tcW w:w="1800" w:type="dxa"/>
+          </w:tcPr>
+          <w:p>
+            <w:r>
+              <w:t>Supports</w:t>
+            </w:r>
+          </w:p>
+        </w:tc>
+        <w:tc>
+          <w:tcPr>
+            <w:tcW w:w="4560" w:type="dxa"/>
+          </w:tcPr>
+          <w:p>
+            <w:r>
+              <w:t xml:space="preserve">Nothing on the product's pages flashes.</w:t>
+            </w:r>
+          </w:p>
+        </w:tc>
+      </w:tr>
+      <w:tr>
+        <w:trPr>
+          <w:cantSplit/>
+        </w:trPr>
+        <w:tc>
+          <w:tcPr>
+            <w:tcW w:w="3000" w:type="dxa"/>
+          </w:tcPr>
+          <w:p>
+            <w:r>
+              <w:t xml:space="preserve">2.4.1 Bypass Blocks (Level A)</w:t>
+            </w:r>
+          </w:p>
+        </w:tc>
+        <w:tc>
+          <w:tcPr>
+            <w:tcW w:w="1800" w:type="dxa"/>
+          </w:tcPr>
+          <w:p>
+            <w:r>
+              <w:t>Supports</w:t>
+            </w:r>
+          </w:p>
+        </w:tc>
+        <w:tc>
+          <w:tcPr>
+            <w:tcW w:w="4560" w:type="dxa"/>
+          </w:tcPr>
+          <w:p>
+            <w:r>
+              <w:t xml:space="preserve">A "Skip to content" link starts every page.</w:t>
+            </w:r>
+          </w:p>
+        </w:tc>
+      </w:tr>
+      <w:tr>
+        <w:trPr>
+          <w:cantSplit/>
+        </w:trPr>
+        <w:tc>
+          <w:tcPr>
+            <w:tcW w:w="3000" w:type="dxa"/>
+          </w:tcPr>
+          <w:p>
+            <w:r>
+              <w:t xml:space="preserve">2.4.2 Page Titled (Level A)</w:t>
+            </w:r>
+          </w:p>
+        </w:tc>
+        <w:tc>
+          <w:tcPr>
+            <w:tcW w:w="1800" w:type="dxa"/>
+          </w:tcPr>
+          <w:p>
+            <w:r>
+              <w:t>Supports</w:t>
+            </w:r>
+          </w:p>
+        </w:tc>
+        <w:tc>
+          <w:tcPr>
+            <w:tcW w:w="4560" w:type="dxa"/>
+          </w:tcPr>
+          <w:p>
+            <w:r>
+              <w:t xml:space="preserve">Every page has a title naming the page and the product.</w:t>
+            </w:r>
+          </w:p>
+        </w:tc>
+      </w:tr>
+      <w:tr>
+        <w:trPr>
+          <w:cantSplit/>
+        </w:trPr>
+        <w:tc>
+          <w:tcPr>
+            <w:tcW w:w="3000" w:type="dxa"/>
+          </w:tcPr>
+          <w:p>
+            <w:r>
+              <w:t xml:space="preserve">2.4.3 Focus Order (Level A)</w:t>
+            </w:r>
+          </w:p>
+        </w:tc>
+        <w:tc>
+          <w:tcPr>
+            <w:tcW w:w="1800" w:type="dxa"/>
+          </w:tcPr>
+          <w:p>
+            <w:r>
+              <w:t>Supports</w:t>
+            </w:r>
+          </w:p>
+        </w:tc>
+        <w:tc>
+          <w:tcPr>
+            <w:tcW w:w="4560" w:type="dxa"/>
+          </w:tcPr>
+          <w:p/>
+        </w:tc>
+      </w:tr>
+      <w:tr>
+        <w:trPr>
+          <w:cantSplit/>
+        </w:trPr>
+        <w:tc>
+          <w:tcPr>
+            <w:tcW w:w="3000" w:type="dxa"/>
+          </w:tcPr>
+          <w:p>
+            <w:r>
+              <w:t xml:space="preserve">2.4.4 Link Purpose (In Context) (Level A)</w:t>
+            </w:r>
+          </w:p>
+        </w:tc>
+        <w:tc>
+          <w:tcPr>
+            <w:tcW w:w="1800" w:type="dxa"/>
+          </w:tcPr>
+          <w:p>
+            <w:r>
+              <w:t>Supports</w:t>
+            </w:r>
+          </w:p>
+        </w:tc>
+        <w:tc>
+          <w:tcPr>
+            <w:tcW w:w="4560" w:type="dxa"/>
+          </w:tcPr>
+          <w:p/>
+        </w:tc>
+      </w:tr>
+      <w:tr>
+        <w:trPr>
+          <w:cantSplit/>
+        </w:trPr>
+        <w:tc>
+          <w:tcPr>
+            <w:tcW w:w="3000" w:type="dxa"/>
+          </w:tcPr>
+          <w:p>
+            <w:r>
+              <w:t xml:space="preserve">2.4.5 Multiple Ways (Level AA)</w:t>
+            </w:r>
+          </w:p>
+        </w:tc>
+        <w:tc>
+          <w:tcPr>
+            <w:tcW w:w="1800" w:type="dxa"/>
+          </w:tcPr>
+          <w:p>
+            <w:r>
+              <w:t>Supports</w:t>
+            </w:r>
+          </w:p>
+        </w:tc>
+        <w:tc>
+          <w:tcPr>
+            <w:tcW w:w="4560" w:type="dxa"/>
+          </w:tcPr>
+          <w:p>
+            <w:r>
+              <w:t xml:space="preserve">Every page can be reached from the menu, and from search.</w:t>
+            </w:r>
+          </w:p>
+        </w:tc>
+      </w:tr>
+      <w:tr>
+        <w:trPr>
+          <w:cantSplit/>
+        </w:trPr>
+        <w:tc>
+          <w:tcPr>
+            <w:tcW w:w="3000" w:type="dxa"/>
+          </w:tcPr>
+          <w:p>
+            <w:r>
+              <w:t xml:space="preserve">2.4.6 Headings and Labels (Level AA)</w:t>
+            </w:r>
+          </w:p>
+        </w:tc>
+        <w:tc>
+          <w:tcPr>
+            <w:tcW w:w="1800" w:type="dxa"/>
+          </w:tcPr>
+          <w:p>
+            <w:r>
+              <w:t>Supports</w:t>
+            </w:r>
+          </w:p>
+        </w:tc>
+        <w:tc>
+          <w:tcPr>
+            <w:tcW w:w="4560" w:type="dxa"/>
+          </w:tcPr>
+          <w:p/>
+        </w:tc>
+      </w:tr>
+      <w:tr>
+        <w:trPr>
+          <w:cantSplit/>
+        </w:trPr>
+        <w:tc>
+          <w:tcPr>
+            <w:tcW w:w="3000" w:type="dxa"/>
+          </w:tcPr>
+          <w:p>
+            <w:r>
               <w:t xml:space="preserve">2.4.7 Focus Visible (Level AA)</w:t>
             </w:r>
           </w:p>
@@ -410,6 +1409,282 @@
           </w:tcPr>
           <w:p>
             <w:r>
+              <w:t xml:space="preserve">2.4.11 Focus Not Obscured (Minimum) (Level AA)</w:t>
+            </w:r>
+          </w:p>
+        </w:tc>
+        <w:tc>
+          <w:tcPr>
+            <w:tcW w:w="1800" w:type="dxa"/>
+          </w:tcPr>
+          <w:p>
+            <w:r>
+              <w:t>Supports</w:t>
+            </w:r>
+          </w:p>
+        </w:tc>
+        <w:tc>
+          <w:tcPr>
+            <w:tcW w:w="4560" w:type="dxa"/>
+          </w:tcPr>
+          <w:p>
+            <w:r>
+              <w:t xml:space="preserve">The page's header never covers the focused control.</w:t>
+            </w:r>
+          </w:p>
+        </w:tc>
+      </w:tr>
+      <w:tr>
+        <w:trPr>
+          <w:cantSplit/>
+        </w:trPr>
+        <w:tc>
+          <w:tcPr>
+            <w:tcW w:w="3000" w:type="dxa"/>
+          </w:tcPr>
+          <w:p>
+            <w:r>
+              <w:t xml:space="preserve">2.4.13 Focus Appearance (Level AAA)</w:t>
+            </w:r>
+          </w:p>
+        </w:tc>
+        <w:tc>
+          <w:tcPr>
+            <w:tcW w:w="1800" w:type="dxa"/>
+          </w:tcPr>
+          <w:p>
+            <w:r>
+              <w:t>Not Evaluated</w:t>
+            </w:r>
+          </w:p>
+        </w:tc>
+        <w:tc>
+          <w:tcPr>
+            <w:tcW w:w="4560" w:type="dxa"/>
+          </w:tcPr>
+          <w:p>
+            <w:r>
+              <w:t xml:space="preserve">Level AAA; not evaluated.</w:t>
+            </w:r>
+          </w:p>
+        </w:tc>
+      </w:tr>
+      <w:tr>
+        <w:trPr>
+          <w:cantSplit/>
+        </w:trPr>
+        <w:tc>
+          <w:tcPr>
+            <w:tcW w:w="3000" w:type="dxa"/>
+          </w:tcPr>
+          <w:p>
+            <w:r>
+              <w:t xml:space="preserve">2.5.1 Pointer Gestures (Level A)</w:t>
+            </w:r>
+          </w:p>
+        </w:tc>
+        <w:tc>
+          <w:tcPr>
+            <w:tcW w:w="1800" w:type="dxa"/>
+          </w:tcPr>
+          <w:p>
+            <w:r>
+              <w:t>Not Applicable</w:t>
+            </w:r>
+          </w:p>
+        </w:tc>
+        <w:tc>
+          <w:tcPr>
+            <w:tcW w:w="4560" w:type="dxa"/>
+          </w:tcPr>
+          <w:p>
+            <w:r>
+              <w:t xml:space="preserve">No function uses a path-based or multipoint gesture.</w:t>
+            </w:r>
+          </w:p>
+        </w:tc>
+      </w:tr>
+      <w:tr>
+        <w:trPr>
+          <w:cantSplit/>
+        </w:trPr>
+        <w:tc>
+          <w:tcPr>
+            <w:tcW w:w="3000" w:type="dxa"/>
+          </w:tcPr>
+          <w:p>
+            <w:r>
+              <w:t xml:space="preserve">2.5.2 Pointer Cancellation (Level A)</w:t>
+            </w:r>
+          </w:p>
+        </w:tc>
+        <w:tc>
+          <w:tcPr>
+            <w:tcW w:w="1800" w:type="dxa"/>
+          </w:tcPr>
+          <w:p>
+            <w:r>
+              <w:t>Supports</w:t>
+            </w:r>
+          </w:p>
+        </w:tc>
+        <w:tc>
+          <w:tcPr>
+            <w:tcW w:w="4560" w:type="dxa"/>
+          </w:tcPr>
+          <w:p>
+            <w:r>
+              <w:t xml:space="preserve">Controls act when the pointer is released.</w:t>
+            </w:r>
+          </w:p>
+        </w:tc>
+      </w:tr>
+      <w:tr>
+        <w:trPr>
+          <w:cantSplit/>
+        </w:trPr>
+        <w:tc>
+          <w:tcPr>
+            <w:tcW w:w="3000" w:type="dxa"/>
+          </w:tcPr>
+          <w:p>
+            <w:r>
+              <w:t xml:space="preserve">2.5.3 Label in Name (Level A)</w:t>
+            </w:r>
+          </w:p>
+        </w:tc>
+        <w:tc>
+          <w:tcPr>
+            <w:tcW w:w="1800" w:type="dxa"/>
+          </w:tcPr>
+          <w:p>
+            <w:r>
+              <w:t>Supports</w:t>
+            </w:r>
+          </w:p>
+        </w:tc>
+        <w:tc>
+          <w:tcPr>
+            <w:tcW w:w="4560" w:type="dxa"/>
+          </w:tcPr>
+          <w:p/>
+        </w:tc>
+      </w:tr>
+      <w:tr>
+        <w:trPr>
+          <w:cantSplit/>
+        </w:trPr>
+        <w:tc>
+          <w:tcPr>
+            <w:tcW w:w="3000" w:type="dxa"/>
+          </w:tcPr>
+          <w:p>
+            <w:r>
+              <w:t xml:space="preserve">2.5.4 Motion Actuation (Level A)</w:t>
+            </w:r>
+          </w:p>
+        </w:tc>
+        <w:tc>
+          <w:tcPr>
+            <w:tcW w:w="1800" w:type="dxa"/>
+          </w:tcPr>
+          <w:p>
+            <w:r>
+              <w:t>Not Applicable</w:t>
+            </w:r>
+          </w:p>
+        </w:tc>
+        <w:tc>
+          <w:tcPr>
+            <w:tcW w:w="4560" w:type="dxa"/>
+          </w:tcPr>
+          <w:p>
+            <w:r>
+              <w:t xml:space="preserve">No function is operated by moving the device.</w:t>
+            </w:r>
+          </w:p>
+        </w:tc>
+      </w:tr>
+      <w:tr>
+        <w:trPr>
+          <w:cantSplit/>
+        </w:trPr>
+        <w:tc>
+          <w:tcPr>
+            <w:tcW w:w="3000" w:type="dxa"/>
+          </w:tcPr>
+          <w:p>
+            <w:r>
+              <w:t xml:space="preserve">2.5.7 Dragging Movements (Level AA)</w:t>
+            </w:r>
+          </w:p>
+        </w:tc>
+        <w:tc>
+          <w:tcPr>
+            <w:tcW w:w="1800" w:type="dxa"/>
+          </w:tcPr>
+          <w:p>
+            <w:r>
+              <w:t>Not Applicable</w:t>
+            </w:r>
+          </w:p>
+        </w:tc>
+        <w:tc>
+          <w:tcPr>
+            <w:tcW w:w="4560" w:type="dxa"/>
+          </w:tcPr>
+          <w:p>
+            <w:r>
+              <w:t xml:space="preserve">No function needs dragging.</w:t>
+            </w:r>
+          </w:p>
+        </w:tc>
+      </w:tr>
+      <w:tr>
+        <w:trPr>
+          <w:cantSplit/>
+        </w:trPr>
+        <w:tc>
+          <w:tcPr>
+            <w:tcW w:w="3000" w:type="dxa"/>
+          </w:tcPr>
+          <w:p>
+            <w:r>
+              <w:t xml:space="preserve">2.5.8 Target Size (Minimum) (Level AA)</w:t>
+            </w:r>
+          </w:p>
+        </w:tc>
+        <w:tc>
+          <w:tcPr>
+            <w:tcW w:w="1800" w:type="dxa"/>
+          </w:tcPr>
+          <w:p>
+            <w:r>
+              <w:t>Supports</w:t>
+            </w:r>
+          </w:p>
+        </w:tc>
+        <w:tc>
+          <w:tcPr>
+            <w:tcW w:w="4560" w:type="dxa"/>
+          </w:tcPr>
+          <w:p>
+            <w:r>
+              <w:t xml:space="preserve">Every target is at least 24 by 24 CSS pixels.</w:t>
+            </w:r>
+          </w:p>
+        </w:tc>
+      </w:tr>
+      <w:tr>
+        <w:trPr>
+          <w:cantSplit/>
+        </w:trPr>
+        <w:tc>
+          <w:tcPr>
+            <w:tcW w:w="3000" w:type="dxa"/>
+          </w:tcPr>
+          <w:p>
+            <w:r>
               <w:t xml:space="preserve">3.1.1 Language of Page (Level A)</w:t>
             </w:r>
           </w:p>
@@ -441,6 +1716,410 @@
           </w:tcPr>
           <w:p>
             <w:r>
+              <w:t xml:space="preserve">3.1.2 Language of Parts (Level AA)</w:t>
+            </w:r>
+          </w:p>
+        </w:tc>
+        <w:tc>
+          <w:tcPr>
+            <w:tcW w:w="1800" w:type="dxa"/>
+          </w:tcPr>
+          <w:p>
+            <w:r>
+              <w:t>Not Applicable</w:t>
+            </w:r>
+          </w:p>
+        </w:tc>
+        <w:tc>
+          <w:tcPr>
+            <w:tcW w:w="4560" w:type="dxa"/>
+          </w:tcPr>
+          <w:p>
+            <w:r>
+              <w:t xml:space="preserve">The product's text is all in one language.</w:t>
+            </w:r>
+          </w:p>
+        </w:tc>
+      </w:tr>
+      <w:tr>
+        <w:trPr>
+          <w:cantSplit/>
+        </w:trPr>
+        <w:tc>
+          <w:tcPr>
+            <w:tcW w:w="3000" w:type="dxa"/>
+          </w:tcPr>
+          <w:p>
+            <w:r>
+              <w:t xml:space="preserve">3.2.1 On Focus (Level A)</w:t>
+            </w:r>
+          </w:p>
+        </w:tc>
+        <w:tc>
+          <w:tcPr>
+            <w:tcW w:w="1800" w:type="dxa"/>
+          </w:tcPr>
+          <w:p>
+            <w:r>
+              <w:t>Supports</w:t>
+            </w:r>
+          </w:p>
+        </w:tc>
+        <w:tc>
+          <w:tcPr>
+            <w:tcW w:w="4560" w:type="dxa"/>
+          </w:tcPr>
+          <w:p/>
+        </w:tc>
+      </w:tr>
+      <w:tr>
+        <w:trPr>
+          <w:cantSplit/>
+        </w:trPr>
+        <w:tc>
+          <w:tcPr>
+            <w:tcW w:w="3000" w:type="dxa"/>
+          </w:tcPr>
+          <w:p>
+            <w:r>
+              <w:t xml:space="preserve">3.2.2 On Input (Level A)</w:t>
+            </w:r>
+          </w:p>
+        </w:tc>
+        <w:tc>
+          <w:tcPr>
+            <w:tcW w:w="1800" w:type="dxa"/>
+          </w:tcPr>
+          <w:p>
+            <w:r>
+              <w:t>Supports</w:t>
+            </w:r>
+          </w:p>
+        </w:tc>
+        <w:tc>
+          <w:tcPr>
+            <w:tcW w:w="4560" w:type="dxa"/>
+          </w:tcPr>
+          <w:p/>
+        </w:tc>
+      </w:tr>
+      <w:tr>
+        <w:trPr>
+          <w:cantSplit/>
+        </w:trPr>
+        <w:tc>
+          <w:tcPr>
+            <w:tcW w:w="3000" w:type="dxa"/>
+          </w:tcPr>
+          <w:p>
+            <w:r>
+              <w:t xml:space="preserve">3.2.3 Consistent Navigation (Level AA)</w:t>
+            </w:r>
+          </w:p>
+        </w:tc>
+        <w:tc>
+          <w:tcPr>
+            <w:tcW w:w="1800" w:type="dxa"/>
+          </w:tcPr>
+          <w:p>
+            <w:r>
+              <w:t>Supports</w:t>
+            </w:r>
+          </w:p>
+        </w:tc>
+        <w:tc>
+          <w:tcPr>
+            <w:tcW w:w="4560" w:type="dxa"/>
+          </w:tcPr>
+          <w:p>
+            <w:r>
+              <w:t xml:space="preserve">The menu is in the same place and order on every page.</w:t>
+            </w:r>
+          </w:p>
+        </w:tc>
+      </w:tr>
+      <w:tr>
+        <w:trPr>
+          <w:cantSplit/>
+        </w:trPr>
+        <w:tc>
+          <w:tcPr>
+            <w:tcW w:w="3000" w:type="dxa"/>
+          </w:tcPr>
+          <w:p>
+            <w:r>
+              <w:t xml:space="preserve">3.2.4 Consistent Identification (Level AA)</w:t>
+            </w:r>
+          </w:p>
+        </w:tc>
+        <w:tc>
+          <w:tcPr>
+            <w:tcW w:w="1800" w:type="dxa"/>
+          </w:tcPr>
+          <w:p>
+            <w:r>
+              <w:t>Supports</w:t>
+            </w:r>
+          </w:p>
+        </w:tc>
+        <w:tc>
+          <w:tcPr>
+            <w:tcW w:w="4560" w:type="dxa"/>
+          </w:tcPr>
+          <w:p/>
+        </w:tc>
+      </w:tr>
+      <w:tr>
+        <w:trPr>
+          <w:cantSplit/>
+        </w:trPr>
+        <w:tc>
+          <w:tcPr>
+            <w:tcW w:w="3000" w:type="dxa"/>
+          </w:tcPr>
+          <w:p>
+            <w:r>
+              <w:t xml:space="preserve">3.2.6 Consistent Help (Level A)</w:t>
+            </w:r>
+          </w:p>
+        </w:tc>
+        <w:tc>
+          <w:tcPr>
+            <w:tcW w:w="1800" w:type="dxa"/>
+          </w:tcPr>
+          <w:p>
+            <w:r>
+              <w:t>Supports</w:t>
+            </w:r>
+          </w:p>
+        </w:tc>
+        <w:tc>
+          <w:tcPr>
+            <w:tcW w:w="4560" w:type="dxa"/>
+          </w:tcPr>
+          <w:p>
+            <w:r>
+              <w:t xml:space="preserve">The help link is in the same place on every page.</w:t>
+            </w:r>
+          </w:p>
+        </w:tc>
+      </w:tr>
+      <w:tr>
+        <w:trPr>
+          <w:cantSplit/>
+        </w:trPr>
+        <w:tc>
+          <w:tcPr>
+            <w:tcW w:w="3000" w:type="dxa"/>
+          </w:tcPr>
+          <w:p>
+            <w:r>
+              <w:t xml:space="preserve">3.3.1 Error Identification (Level A)</w:t>
+            </w:r>
+          </w:p>
+        </w:tc>
+        <w:tc>
+          <w:tcPr>
+            <w:tcW w:w="1800" w:type="dxa"/>
+          </w:tcPr>
+          <w:p>
+            <w:r>
+              <w:t>Supports</w:t>
+            </w:r>
+          </w:p>
+        </w:tc>
+        <w:tc>
+          <w:tcPr>
+            <w:tcW w:w="4560" w:type="dxa"/>
+          </w:tcPr>
+          <w:p>
+            <w:r>
+              <w:t xml:space="preserve">A field in error is named, and the error is described in text.</w:t>
+            </w:r>
+          </w:p>
+        </w:tc>
+      </w:tr>
+      <w:tr>
+        <w:trPr>
+          <w:cantSplit/>
+        </w:trPr>
+        <w:tc>
+          <w:tcPr>
+            <w:tcW w:w="3000" w:type="dxa"/>
+          </w:tcPr>
+          <w:p>
+            <w:r>
+              <w:t xml:space="preserve">3.3.2 Labels or Instructions (Level A)</w:t>
+            </w:r>
+          </w:p>
+        </w:tc>
+        <w:tc>
+          <w:tcPr>
+            <w:tcW w:w="1800" w:type="dxa"/>
+          </w:tcPr>
+          <w:p>
+            <w:r>
+              <w:t>Supports</w:t>
+            </w:r>
+          </w:p>
+        </w:tc>
+        <w:tc>
+          <w:tcPr>
+            <w:tcW w:w="4560" w:type="dxa"/>
+          </w:tcPr>
+          <w:p/>
+        </w:tc>
+      </w:tr>
+      <w:tr>
+        <w:trPr>
+          <w:cantSplit/>
+        </w:trPr>
+        <w:tc>
+          <w:tcPr>
+            <w:tcW w:w="3000" w:type="dxa"/>
+          </w:tcPr>
+          <w:p>
+            <w:r>
+              <w:t xml:space="preserve">3.3.3 Error Suggestion (Level AA)</w:t>
+            </w:r>
+          </w:p>
+        </w:tc>
+        <w:tc>
+          <w:tcPr>
+            <w:tcW w:w="1800" w:type="dxa"/>
+          </w:tcPr>
+          <w:p>
+            <w:r>
+              <w:t>Supports</w:t>
+            </w:r>
+          </w:p>
+        </w:tc>
+        <w:tc>
+          <w:tcPr>
+            <w:tcW w:w="4560" w:type="dxa"/>
+          </w:tcPr>
+          <w:p>
+            <w:r>
+              <w:t xml:space="preserve">Errors say what was expected, such as a date's format.</w:t>
+            </w:r>
+          </w:p>
+        </w:tc>
+      </w:tr>
+      <w:tr>
+        <w:trPr>
+          <w:cantSplit/>
+        </w:trPr>
+        <w:tc>
+          <w:tcPr>
+            <w:tcW w:w="3000" w:type="dxa"/>
+          </w:tcPr>
+          <w:p>
+            <w:r>
+              <w:t xml:space="preserve">3.3.4 Error Prevention (Legal, Financial, Data) (Level AA)</w:t>
+            </w:r>
+          </w:p>
+        </w:tc>
+        <w:tc>
+          <w:tcPr>
+            <w:tcW w:w="1800" w:type="dxa"/>
+          </w:tcPr>
+          <w:p>
+            <w:r>
+              <w:t>Supports</w:t>
+            </w:r>
+          </w:p>
+        </w:tc>
+        <w:tc>
+          <w:tcPr>
+            <w:tcW w:w="4560" w:type="dxa"/>
+          </w:tcPr>
+          <w:p>
+            <w:r>
+              <w:t xml:space="preserve">An invoice can be reviewed before it is sent and recalled for ten minutes after.</w:t>
+            </w:r>
+          </w:p>
+        </w:tc>
+      </w:tr>
+      <w:tr>
+        <w:trPr>
+          <w:cantSplit/>
+        </w:trPr>
+        <w:tc>
+          <w:tcPr>
+            <w:tcW w:w="3000" w:type="dxa"/>
+          </w:tcPr>
+          <w:p>
+            <w:r>
+              <w:t xml:space="preserve">3.3.7 Redundant Entry (Level A)</w:t>
+            </w:r>
+          </w:p>
+        </w:tc>
+        <w:tc>
+          <w:tcPr>
+            <w:tcW w:w="1800" w:type="dxa"/>
+          </w:tcPr>
+          <w:p>
+            <w:r>
+              <w:t>Supports</w:t>
+            </w:r>
+          </w:p>
+        </w:tc>
+        <w:tc>
+          <w:tcPr>
+            <w:tcW w:w="4560" w:type="dxa"/>
+          </w:tcPr>
+          <w:p>
+            <w:r>
+              <w:t xml:space="preserve">The product never asks for the same information twice in one process.</w:t>
+            </w:r>
+          </w:p>
+        </w:tc>
+      </w:tr>
+      <w:tr>
+        <w:trPr>
+          <w:cantSplit/>
+        </w:trPr>
+        <w:tc>
+          <w:tcPr>
+            <w:tcW w:w="3000" w:type="dxa"/>
+          </w:tcPr>
+          <w:p>
+            <w:r>
+              <w:t xml:space="preserve">3.3.8 Accessible Authentication (Minimum) (Level AA)</w:t>
+            </w:r>
+          </w:p>
+        </w:tc>
+        <w:tc>
+          <w:tcPr>
+            <w:tcW w:w="1800" w:type="dxa"/>
+          </w:tcPr>
+          <w:p>
+            <w:r>
+              <w:t>Supports</w:t>
+            </w:r>
+          </w:p>
+        </w:tc>
+        <w:tc>
+          <w:tcPr>
+            <w:tcW w:w="4560" w:type="dxa"/>
+          </w:tcPr>
+          <w:p>
+            <w:r>
+              <w:t xml:space="preserve">Signing in allows a password manager and pasting, and asks no cognitive test.</w:t>
+            </w:r>
+          </w:p>
+        </w:tc>
+      </w:tr>
+      <w:tr>
+        <w:trPr>
+          <w:cantSplit/>
+        </w:trPr>
+        <w:tc>
+          <w:tcPr>
+            <w:tcW w:w="3000" w:type="dxa"/>
+          </w:tcPr>
+          <w:p>
+            <w:r>
               <w:t xml:space="preserve">4.1.2 Name, Role, Value (Level A)</w:t>
             </w:r>
           </w:p>
@@ -476,27 +2155,27 @@
           </w:tcPr>
           <w:p>
             <w:r>
-              <w:t xml:space="preserve">2.4.13 Focus Appearance (Level AAA)</w:t>
-            </w:r>
-          </w:p>
-        </w:tc>
-        <w:tc>
-          <w:tcPr>
-            <w:tcW w:w="1800" w:type="dxa"/>
-          </w:tcPr>
-          <w:p>
-            <w:r>
-              <w:t>Not Evaluated</w:t>
-            </w:r>
-          </w:p>
-        </w:tc>
-        <w:tc>
-          <w:tcPr>
-            <w:tcW w:w="4560" w:type="dxa"/>
-          </w:tcPr>
-          <w:p>
-            <w:r>
-              <w:t xml:space="preserve">Level AAA; not evaluated.</w:t>
+              <w:t xml:space="preserve">4.1.3 Status Messages (Level AA)</w:t>
+            </w:r>
+          </w:p>
+        </w:tc>
+        <w:tc>
+          <w:tcPr>
+            <w:tcW w:w="1800" w:type="dxa"/>
+          </w:tcPr>
+          <w:p>
+            <w:r>
+              <w:t>Supports</w:t>
+            </w:r>
+          </w:p>
+        </w:tc>
+        <w:tc>
+          <w:tcPr>
+            <w:tcW w:w="4560" w:type="dxa"/>
+          </w:tcPr>
+          <w:p>
+            <w:r>
+              <w:t xml:space="preserve">Saved and sent messages are announced as status messages.</w:t>
             </w:r>
           </w:p>
         </w:tc>

</xml_diff>